<commit_message>
이혜경 개발 보조 AI 모델명 ChatGPT(GPT-5.6 Sol) 반영
Co-Authored-By: Claude Opus 5.5 <noreply@anthropic.com>
Claude-Session: https://claude.ai/code/session_01Tvy22XgebarZmgvL1irgJL
</commit_message>
<xml_diff>
--- a/deliverables/final_report/오이소창원_개발완료보고서_20261005.docx
+++ b/deliverables/final_report/오이소창원_개발완료보고서_20261005.docx
@@ -497,7 +497,7 @@
               </w:rPr>
               <w:t xml:space="preserve">배포 앱 </w:t>
             </w:r>
-            <w:hyperlink w:history="1" r:id="rId4nw4xw7dgbts4yqpwzqlu">
+            <w:hyperlink w:history="1" r:id="rId9n64i4kixp7xfvecwvmlz">
               <w:r>
                 <w:rPr>
                   <w:rStyle w:val="Hyperlink"/>
@@ -516,7 +516,7 @@
               </w:rPr>
               <w:t xml:space="preserve"> · 저장소 </w:t>
             </w:r>
-            <w:hyperlink w:history="1" r:id="rId3rkqe6brhl1g9xthwz1vj">
+            <w:hyperlink w:history="1" r:id="rId0oz05snosh1r9q2t1vyrf">
               <w:r>
                 <w:rPr>
                   <w:rStyle w:val="Hyperlink"/>
@@ -2728,7 +2728,7 @@
                 <w:sz w:val="17"/>
                 <w:szCs w:val="17"/>
               </w:rPr>
-              <w:t xml:space="preserve">이혜경 Claude Opus 5.5(추론 수준 중간)·GPT / 조준수 ChatGPT(GPT-5.6 Sol·GPT-6 Astra Pro)·OpenAI Codex(SOL/Light·Astra/Ultra)·Gemini 3.8 Flash / 이미영 ChatGPT(GPT 솔라이트 6.1·GPT) — 코드·문서·UX/UI·발표자료 보조, 결정·검수는 사람(「출처·AI 활용 신고서」)</w:t>
+              <w:t xml:space="preserve">이혜경 Claude Opus 5.5(추론 수준 중간)·ChatGPT(GPT-5.6 Sol) / 조준수 ChatGPT(GPT-5.6 Sol·GPT-6 Astra Pro)·OpenAI Codex(SOL/Light·Astra/Ultra)·Gemini 3.8 Flash / 이미영 ChatGPT(GPT 솔라이트 6.1·GPT) — 코드·문서·UX/UI·발표자료 보조, 결정·검수는 사람(「출처·AI 활용 신고서」)</w:t>
             </w:r>
           </w:p>
         </w:tc>

</xml_diff>